<commit_message>
update guide about picture upload
</commit_message>
<xml_diff>
--- a/Project documents/Guide for Developer.docx
+++ b/Project documents/Guide for Developer.docx
@@ -1178,65 +1178,69 @@
       </w:r>
     </w:p>
     <w:p>
-      <w:r>
-        <w:rPr>
-          <w:rFonts w:hint="eastAsia"/>
-        </w:rPr>
-        <w:t xml:space="preserve">I have </w:t>
-      </w:r>
-      <w:r>
-        <w:t>written</w:t>
-      </w:r>
-      <w:r>
-        <w:rPr>
-          <w:rFonts w:hint="eastAsia"/>
-        </w:rPr>
-        <w:t xml:space="preserve"> a class </w:t>
-      </w:r>
-      <w:r>
-        <w:t>CloudinaryUploader</w:t>
-      </w:r>
-      <w:r>
-        <w:rPr>
-          <w:rFonts w:hint="eastAsia"/>
-        </w:rPr>
-        <w:t xml:space="preserve"> to deal with </w:t>
-      </w:r>
-      <w:r>
-        <w:t>images</w:t>
-      </w:r>
-      <w:r>
-        <w:rPr>
-          <w:rFonts w:hint="eastAsia"/>
-        </w:rPr>
-        <w:t xml:space="preserve">. </w:t>
-      </w:r>
-      <w:r>
-        <w:t>Y</w:t>
-      </w:r>
-      <w:r>
-        <w:rPr>
-          <w:rFonts w:hint="eastAsia"/>
-        </w:rPr>
-        <w:t xml:space="preserve">ou can use it </w:t>
-      </w:r>
-      <w:r>
-        <w:t xml:space="preserve">to </w:t>
-      </w:r>
-      <w:r>
-        <w:rPr>
-          <w:rFonts w:hint="eastAsia"/>
-        </w:rPr>
-        <w:t>r</w:t>
-      </w:r>
-      <w:r>
-        <w:t>efer to the example</w:t>
-      </w:r>
-      <w:r>
-        <w:rPr>
-          <w:rFonts w:hint="eastAsia"/>
-        </w:rPr>
-        <w:t>: TestActivity.</w:t>
+      <w:pPr>
+        <w:rPr>
+          <w:rFonts w:hint="eastAsia"/>
+        </w:rPr>
+      </w:pPr>
+      <w:r>
+        <w:rPr>
+          <w:rFonts w:hint="eastAsia"/>
+        </w:rPr>
+        <w:t xml:space="preserve">Firstly, you should copy my local.properties to your </w:t>
+      </w:r>
+      <w:r>
+        <w:t>Grabyourgear</w:t>
+      </w:r>
+      <w:r>
+        <w:rPr>
+          <w:rFonts w:hint="eastAsia"/>
+        </w:rPr>
+        <w:t xml:space="preserve"> folder. </w:t>
+      </w:r>
+      <w:r>
+        <w:t>T</w:t>
+      </w:r>
+      <w:r>
+        <w:rPr>
+          <w:rFonts w:hint="eastAsia"/>
+        </w:rPr>
+        <w:t>hen you can refer to Profile activity (upload avatar and show).</w:t>
+      </w:r>
+    </w:p>
+    <w:p>
+      <w:r>
+        <w:object w:dxaOrig="1490" w:dyaOrig="1008" w14:anchorId="6E9B7919">
+          <v:shapetype id="_x0000_t75" coordsize="21600,21600" o:spt="75" o:preferrelative="t" path="m@4@5l@4@11@9@11@9@5xe" filled="f" stroked="f">
+            <v:stroke joinstyle="miter"/>
+            <v:formulas>
+              <v:f eqn="if lineDrawn pixelLineWidth 0"/>
+              <v:f eqn="sum @0 1 0"/>
+              <v:f eqn="sum 0 0 @1"/>
+              <v:f eqn="prod @2 1 2"/>
+              <v:f eqn="prod @3 21600 pixelWidth"/>
+              <v:f eqn="prod @3 21600 pixelHeight"/>
+              <v:f eqn="sum @0 0 1"/>
+              <v:f eqn="prod @6 1 2"/>
+              <v:f eqn="prod @7 21600 pixelWidth"/>
+              <v:f eqn="sum @8 21600 0"/>
+              <v:f eqn="prod @7 21600 pixelHeight"/>
+              <v:f eqn="sum @10 21600 0"/>
+            </v:formulas>
+            <v:path o:extrusionok="f" gradientshapeok="t" o:connecttype="rect"/>
+            <o:lock v:ext="edit" aspectratio="t"/>
+          </v:shapetype>
+          <v:shape id="_x0000_i1025" type="#_x0000_t75" style="width:74.5pt;height:50.35pt" o:ole="">
+            <v:imagedata r:id="rId19" o:title=""/>
+          </v:shape>
+          <o:OLEObject Type="Embed" ProgID="Package" ShapeID="_x0000_i1025" DrawAspect="Icon" ObjectID="_1838358776" r:id="rId20"/>
+        </w:object>
+      </w:r>
+      <w:r>
+        <w:rPr>
+          <w:rFonts w:hint="eastAsia"/>
+        </w:rPr>
+        <w:t>.</w:t>
       </w:r>
     </w:p>
     <w:p>
@@ -1246,10 +1250,10 @@
         </w:rPr>
         <w:lastRenderedPageBreak/>
         <w:drawing>
-          <wp:inline distT="0" distB="0" distL="0" distR="0" wp14:anchorId="6F54B222" wp14:editId="1F42C301">
-            <wp:extent cx="4780952" cy="6323809"/>
-            <wp:effectExtent l="0" t="0" r="635" b="1270"/>
-            <wp:docPr id="685950325" name="Picture 1"/>
+          <wp:inline distT="0" distB="0" distL="0" distR="0" wp14:anchorId="14E2DC87" wp14:editId="1524FC07">
+            <wp:extent cx="5731510" cy="1258570"/>
+            <wp:effectExtent l="0" t="0" r="2540" b="0"/>
+            <wp:docPr id="2102288872" name="Picture 1"/>
             <wp:cNvGraphicFramePr>
               <a:graphicFrameLocks xmlns:a="http://schemas.openxmlformats.org/drawingml/2006/main" noChangeAspect="1"/>
             </wp:cNvGraphicFramePr>
@@ -1257,11 +1261,11 @@
               <a:graphicData uri="http://schemas.openxmlformats.org/drawingml/2006/picture">
                 <pic:pic xmlns:pic="http://schemas.openxmlformats.org/drawingml/2006/picture">
                   <pic:nvPicPr>
-                    <pic:cNvPr id="685950325" name=""/>
+                    <pic:cNvPr id="2102288872" name=""/>
                     <pic:cNvPicPr/>
                   </pic:nvPicPr>
                   <pic:blipFill>
-                    <a:blip r:embed="rId19"/>
+                    <a:blip r:embed="rId21"/>
                     <a:stretch>
                       <a:fillRect/>
                     </a:stretch>
@@ -1269,7 +1273,7 @@
                   <pic:spPr>
                     <a:xfrm>
                       <a:off x="0" y="0"/>
-                      <a:ext cx="4780952" cy="6323809"/>
+                      <a:ext cx="5731510" cy="1258570"/>
                     </a:xfrm>
                     <a:prstGeom prst="rect">
                       <a:avLst/>
@@ -1477,7 +1481,6 @@
     </w:p>
     <w:p>
       <w:r>
-        <w:lastRenderedPageBreak/>
         <w:t>.\adb shell am broadcast -a android.intent.action.MEDIA_SCANNER_SCAN_FILE -d file:///sdcard/DCIM/background.jpeg</w:t>
       </w:r>
       <w:r>
@@ -1507,11 +1510,6 @@
       </w:r>
     </w:p>
     <w:p>
-      <w:pPr>
-        <w:rPr>
-          <w:rFonts w:hint="eastAsia"/>
-        </w:rPr>
-      </w:pPr>
       <w:r>
         <w:rPr>
           <w:rFonts w:hint="eastAsia"/>
@@ -1540,7 +1538,7 @@
                     <pic:cNvPicPr/>
                   </pic:nvPicPr>
                   <pic:blipFill>
-                    <a:blip r:embed="rId20"/>
+                    <a:blip r:embed="rId22"/>
                     <a:stretch>
                       <a:fillRect/>
                     </a:stretch>
@@ -1561,13 +1559,7 @@
         </w:drawing>
       </w:r>
     </w:p>
-    <w:p>
-      <w:pPr>
-        <w:rPr>
-          <w:rFonts w:hint="eastAsia"/>
-        </w:rPr>
-      </w:pPr>
-    </w:p>
+    <w:p/>
     <w:sectPr>
       <w:pgSz w:w="11906" w:h="16838"/>
       <w:pgMar w:top="1440" w:right="1440" w:bottom="1440" w:left="1440" w:header="708" w:footer="708" w:gutter="0"/>
@@ -1669,17 +1661,17 @@
   <w:abstractNum w:abstractNumId="1" w15:restartNumberingAfterBreak="0">
     <w:nsid w:val="31FD71E4"/>
     <w:multiLevelType w:val="hybridMultilevel"/>
-    <w:tmpl w:val="9B0C8380"/>
-    <w:lvl w:ilvl="0" w:tplc="1409000F">
-      <w:start w:val="1"/>
-      <w:numFmt w:val="decimal"/>
-      <w:lvlText w:val="%1."/>
+    <w:tmpl w:val="A67A4142"/>
+    <w:lvl w:ilvl="0" w:tplc="14090001">
+      <w:start w:val="1"/>
+      <w:numFmt w:val="bullet"/>
+      <w:lvlText w:val=""/>
       <w:lvlJc w:val="left"/>
       <w:pPr>
         <w:ind w:left="720" w:hanging="360"/>
       </w:pPr>
       <w:rPr>
-        <w:rFonts w:hint="default"/>
+        <w:rFonts w:ascii="Symbol" w:hAnsi="Symbol" w:hint="default"/>
       </w:rPr>
     </w:lvl>
     <w:lvl w:ilvl="1" w:tplc="14090019" w:tentative="1">
@@ -2703,6 +2695,7 @@
   <w:style w:type="character" w:default="1" w:styleId="DefaultParagraphFont">
     <w:name w:val="Default Paragraph Font"/>
     <w:uiPriority w:val="1"/>
+    <w:semiHidden/>
     <w:unhideWhenUsed/>
   </w:style>
   <w:style w:type="table" w:default="1" w:styleId="TableNormal">

</xml_diff>